<commit_message>
Corrige posicionamento das caixas de média no gráfico de volatilidade
</commit_message>
<xml_diff>
--- a/tcc_furb/Artigo-TCC-BCC(vs finaleira) 4.docx
+++ b/tcc_furb/Artigo-TCC-BCC(vs finaleira) 4.docx
@@ -1,6 +1,6 @@
 
 <file path=word/document.xml><?xml version="1.0" encoding="utf-8"?>
-<w:document xmlns:wpc="http://schemas.microsoft.com/office/word/2010/wordprocessingCanvas" xmlns:cx="http://schemas.microsoft.com/office/drawing/2014/chartex" xmlns:cx1="http://schemas.microsoft.com/office/drawing/2015/9/8/chartex" xmlns:cx2="http://schemas.microsoft.com/office/drawing/2015/10/21/chartex" xmlns:cx3="http://schemas.microsoft.com/office/drawing/2016/5/9/chartex" xmlns:cx4="http://schemas.microsoft.com/office/drawing/2016/5/10/chartex" xmlns:cx5="http://schemas.microsoft.com/office/drawing/2016/5/11/chartex" xmlns:cx6="http://schemas.microsoft.com/office/drawing/2016/5/12/chartex" xmlns:cx7="http://schemas.microsoft.com/office/drawing/2016/5/13/chartex" xmlns:cx8="http://schemas.microsoft.com/office/drawing/2016/5/14/chartex" xmlns:mc="http://schemas.openxmlformats.org/markup-compatibility/2006" xmlns:aink="http://schemas.microsoft.com/office/drawing/2016/ink" xmlns:am3d="http://schemas.microsoft.com/office/drawing/2017/model3d" xmlns:o="urn:schemas-microsoft-com:office:office" xmlns:oel="http://schemas.microsoft.com/office/2019/extlst" xmlns:r="http://schemas.openxmlformats.org/officeDocument/2006/relationships" xmlns:m="http://schemas.openxmlformats.org/officeDocument/2006/math" xmlns:v="urn:schemas-microsoft-com:vml" xmlns:wp14="http://schemas.microsoft.com/office/word/2010/wordprocessingDrawing" xmlns:wp="http://schemas.openxmlformats.org/drawingml/2006/wordprocessingDrawing" xmlns:w10="urn:schemas-microsoft-com:office:word" xmlns:w="http://schemas.openxmlformats.org/wordprocessingml/2006/main" xmlns:w14="http://schemas.microsoft.com/office/word/2010/wordml" xmlns:w15="http://schemas.microsoft.com/office/word/2012/wordml" xmlns:w16cex="http://schemas.microsoft.com/office/word/2018/wordml/cex" xmlns:w16cid="http://schemas.microsoft.com/office/word/2016/wordml/cid" xmlns:w16="http://schemas.microsoft.com/office/word/2018/wordml" xmlns:w16sdtdh="http://schemas.microsoft.com/office/word/2020/wordml/sdtdatahash" xmlns:w16se="http://schemas.microsoft.com/office/word/2015/wordml/symex" xmlns:wpg="http://schemas.microsoft.com/office/word/2010/wordprocessingGroup" xmlns:wpi="http://schemas.microsoft.com/office/word/2010/wordprocessingInk" xmlns:wne="http://schemas.microsoft.com/office/word/2006/wordml" xmlns:wps="http://schemas.microsoft.com/office/word/2010/wordprocessingShape" mc:Ignorable="w14 w15 w16se w16cid w16 w16cex w16sdtdh wp14">
+<w:document xmlns:wpc="http://schemas.microsoft.com/office/word/2010/wordprocessingCanvas" xmlns:cx="http://schemas.microsoft.com/office/drawing/2014/chartex" xmlns:cx1="http://schemas.microsoft.com/office/drawing/2015/9/8/chartex" xmlns:cx2="http://schemas.microsoft.com/office/drawing/2015/10/21/chartex" xmlns:cx3="http://schemas.microsoft.com/office/drawing/2016/5/9/chartex" xmlns:cx4="http://schemas.microsoft.com/office/drawing/2016/5/10/chartex" xmlns:cx5="http://schemas.microsoft.com/office/drawing/2016/5/11/chartex" xmlns:cx6="http://schemas.microsoft.com/office/drawing/2016/5/12/chartex" xmlns:cx7="http://schemas.microsoft.com/office/drawing/2016/5/13/chartex" xmlns:cx8="http://schemas.microsoft.com/office/drawing/2016/5/14/chartex" xmlns:mc="http://schemas.openxmlformats.org/markup-compatibility/2006" xmlns:aink="http://schemas.microsoft.com/office/drawing/2016/ink" xmlns:am3d="http://schemas.microsoft.com/office/drawing/2017/model3d" xmlns:o="urn:schemas-microsoft-com:office:office" xmlns:oel="http://schemas.microsoft.com/office/2019/extlst" xmlns:r="http://schemas.openxmlformats.org/officeDocument/2006/relationships" xmlns:m="http://schemas.openxmlformats.org/officeDocument/2006/math" xmlns:v="urn:schemas-microsoft-com:vml" xmlns:wp14="http://schemas.microsoft.com/office/word/2010/wordprocessingDrawing" xmlns:wp="http://schemas.openxmlformats.org/drawingml/2006/wordprocessingDrawing" xmlns:w10="urn:schemas-microsoft-com:office:word" xmlns:w="http://schemas.openxmlformats.org/wordprocessingml/2006/main" xmlns:w14="http://schemas.microsoft.com/office/word/2010/wordml" xmlns:w15="http://schemas.microsoft.com/office/word/2012/wordml" xmlns:w16cex="http://schemas.microsoft.com/office/word/2018/wordml/cex" xmlns:w16cid="http://schemas.microsoft.com/office/word/2016/wordml/cid" xmlns:w16="http://schemas.microsoft.com/office/word/2018/wordml" xmlns:w16du="http://schemas.microsoft.com/office/word/2023/wordml/word16du" xmlns:w16sdtdh="http://schemas.microsoft.com/office/word/2020/wordml/sdtdatahash" xmlns:w16sdtfl="http://schemas.microsoft.com/office/word/2024/wordml/sdtformatlock" xmlns:w16se="http://schemas.microsoft.com/office/word/2015/wordml/symex" xmlns:wpg="http://schemas.microsoft.com/office/word/2010/wordprocessingGroup" xmlns:wpi="http://schemas.microsoft.com/office/word/2010/wordprocessingInk" xmlns:wne="http://schemas.microsoft.com/office/word/2006/wordml" xmlns:wps="http://schemas.microsoft.com/office/word/2010/wordprocessingShape" mc:Ignorable="w14 w15 w16se w16cid w16 w16cex w16sdtdh w16sdtfl w16du wp14">
   <w:body>
     <w:p>
       <w:pPr>
@@ -1759,16 +1759,8 @@
               <w:rPr>
                 <w:rFonts w:ascii="Courier New" w:hAnsi="Courier New" w:cs="Courier New"/>
               </w:rPr>
-              <w:t xml:space="preserve">end </w:t>
-            </w:r>
-            <w:proofErr w:type="gramStart"/>
-            <w:r>
-              <w:rPr>
-                <w:rFonts w:ascii="Courier New" w:hAnsi="Courier New" w:cs="Courier New"/>
-              </w:rPr>
-              <w:t>for</w:t>
-            </w:r>
-            <w:proofErr w:type="gramEnd"/>
+              <w:t>end for</w:t>
+            </w:r>
           </w:p>
           <w:p>
             <w:pPr>
@@ -1821,13 +1813,27 @@
               <w:rPr>
                 <w:rFonts w:ascii="Courier New" w:hAnsi="Courier New" w:cs="Courier New"/>
               </w:rPr>
-              <w:t xml:space="preserve">     c</w:t>
-            </w:r>
+              <w:t xml:space="preserve">     </w:t>
+            </w:r>
+            <w:proofErr w:type="gramStart"/>
             <w:r>
               <w:rPr>
                 <w:rFonts w:ascii="Courier New" w:hAnsi="Courier New" w:cs="Courier New"/>
               </w:rPr>
-              <w:t xml:space="preserve">alculate the fitness of all grey </w:t>
+              <w:t>c</w:t>
+            </w:r>
+            <w:r>
+              <w:rPr>
+                <w:rFonts w:ascii="Courier New" w:hAnsi="Courier New" w:cs="Courier New"/>
+              </w:rPr>
+              <w:t>alculate</w:t>
+            </w:r>
+            <w:proofErr w:type="gramEnd"/>
+            <w:r>
+              <w:rPr>
+                <w:rFonts w:ascii="Courier New" w:hAnsi="Courier New" w:cs="Courier New"/>
+              </w:rPr>
+              <w:t xml:space="preserve"> the fitness of all grey </w:t>
             </w:r>
             <w:proofErr w:type="gramStart"/>
             <w:r>
@@ -2249,7 +2255,15 @@
       </w:r>
       <w:proofErr w:type="spellEnd"/>
       <w:r>
-        <w:t xml:space="preserve"> e todo o restante do código contido nele, nela é feito diversos ajustes nos parâmetros iniciais e também a sua avaliação. A avaliação pode realizada visando o menor ou o maior valor possível. Por fim, em </w:t>
+        <w:t xml:space="preserve"> e todo o restante do código contido nele, nela é feito diversos ajustes nos parâmetros iniciais </w:t>
+      </w:r>
+      <w:proofErr w:type="gramStart"/>
+      <w:r>
+        <w:t>e também</w:t>
+      </w:r>
+      <w:proofErr w:type="gramEnd"/>
+      <w:r>
+        <w:t xml:space="preserve"> a sua avaliação. A avaliação pode realizada visando o menor ou o maior valor possível. Por fim, em </w:t>
       </w:r>
       <w:proofErr w:type="spellStart"/>
       <w:r>
@@ -2723,7 +2737,6 @@
         <w:tc>
           <w:tcPr>
             <w:tcW w:w="1699" w:type="dxa"/>
-            <w:shd w:val="clear" w:color="auto" w:fill="auto"/>
           </w:tcPr>
           <w:p>
             <w:pPr>
@@ -2737,7 +2750,6 @@
         <w:tc>
           <w:tcPr>
             <w:tcW w:w="7822" w:type="dxa"/>
-            <w:shd w:val="clear" w:color="auto" w:fill="auto"/>
           </w:tcPr>
           <w:p>
             <w:pPr>
@@ -2753,7 +2765,6 @@
         <w:tc>
           <w:tcPr>
             <w:tcW w:w="1699" w:type="dxa"/>
-            <w:shd w:val="clear" w:color="auto" w:fill="auto"/>
           </w:tcPr>
           <w:p>
             <w:pPr>
@@ -2767,7 +2778,6 @@
         <w:tc>
           <w:tcPr>
             <w:tcW w:w="7822" w:type="dxa"/>
-            <w:shd w:val="clear" w:color="auto" w:fill="auto"/>
             <w:vAlign w:val="center"/>
           </w:tcPr>
           <w:p>
@@ -2784,7 +2794,6 @@
         <w:tc>
           <w:tcPr>
             <w:tcW w:w="1699" w:type="dxa"/>
-            <w:shd w:val="clear" w:color="auto" w:fill="auto"/>
           </w:tcPr>
           <w:p>
             <w:pPr>
@@ -2798,7 +2807,6 @@
         <w:tc>
           <w:tcPr>
             <w:tcW w:w="7822" w:type="dxa"/>
-            <w:shd w:val="clear" w:color="auto" w:fill="auto"/>
           </w:tcPr>
           <w:p>
             <w:pPr>
@@ -2814,7 +2822,6 @@
         <w:tc>
           <w:tcPr>
             <w:tcW w:w="1699" w:type="dxa"/>
-            <w:shd w:val="clear" w:color="auto" w:fill="auto"/>
           </w:tcPr>
           <w:p>
             <w:pPr>
@@ -2828,7 +2835,6 @@
         <w:tc>
           <w:tcPr>
             <w:tcW w:w="7822" w:type="dxa"/>
-            <w:shd w:val="clear" w:color="auto" w:fill="auto"/>
           </w:tcPr>
           <w:p>
             <w:pPr>
@@ -2867,7 +2873,6 @@
         <w:tc>
           <w:tcPr>
             <w:tcW w:w="1699" w:type="dxa"/>
-            <w:shd w:val="clear" w:color="auto" w:fill="auto"/>
           </w:tcPr>
           <w:p>
             <w:pPr>
@@ -2881,7 +2886,6 @@
         <w:tc>
           <w:tcPr>
             <w:tcW w:w="7822" w:type="dxa"/>
-            <w:shd w:val="clear" w:color="auto" w:fill="auto"/>
           </w:tcPr>
           <w:p>
             <w:pPr>
@@ -2977,7 +2981,6 @@
         <w:tc>
           <w:tcPr>
             <w:tcW w:w="1699" w:type="dxa"/>
-            <w:shd w:val="clear" w:color="auto" w:fill="auto"/>
           </w:tcPr>
           <w:p>
             <w:pPr>
@@ -2991,7 +2994,6 @@
         <w:tc>
           <w:tcPr>
             <w:tcW w:w="7822" w:type="dxa"/>
-            <w:shd w:val="clear" w:color="auto" w:fill="auto"/>
           </w:tcPr>
           <w:p>
             <w:pPr>
@@ -3023,7 +3025,6 @@
         <w:tc>
           <w:tcPr>
             <w:tcW w:w="1699" w:type="dxa"/>
-            <w:shd w:val="clear" w:color="auto" w:fill="auto"/>
           </w:tcPr>
           <w:p>
             <w:pPr>
@@ -3037,7 +3038,6 @@
         <w:tc>
           <w:tcPr>
             <w:tcW w:w="7822" w:type="dxa"/>
-            <w:shd w:val="clear" w:color="auto" w:fill="auto"/>
             <w:vAlign w:val="center"/>
           </w:tcPr>
           <w:p>
@@ -3060,7 +3060,6 @@
         <w:tc>
           <w:tcPr>
             <w:tcW w:w="1699" w:type="dxa"/>
-            <w:shd w:val="clear" w:color="auto" w:fill="auto"/>
           </w:tcPr>
           <w:p>
             <w:pPr>
@@ -3074,7 +3073,6 @@
         <w:tc>
           <w:tcPr>
             <w:tcW w:w="7822" w:type="dxa"/>
-            <w:shd w:val="clear" w:color="auto" w:fill="auto"/>
           </w:tcPr>
           <w:p>
             <w:pPr>
@@ -3093,7 +3091,6 @@
         <w:tc>
           <w:tcPr>
             <w:tcW w:w="1699" w:type="dxa"/>
-            <w:shd w:val="clear" w:color="auto" w:fill="auto"/>
           </w:tcPr>
           <w:p>
             <w:pPr>
@@ -3107,7 +3104,6 @@
         <w:tc>
           <w:tcPr>
             <w:tcW w:w="7822" w:type="dxa"/>
-            <w:shd w:val="clear" w:color="auto" w:fill="auto"/>
           </w:tcPr>
           <w:p>
             <w:pPr>
@@ -3174,7 +3170,6 @@
         <w:tc>
           <w:tcPr>
             <w:tcW w:w="1699" w:type="dxa"/>
-            <w:shd w:val="clear" w:color="auto" w:fill="auto"/>
           </w:tcPr>
           <w:p>
             <w:pPr>
@@ -3188,7 +3183,6 @@
         <w:tc>
           <w:tcPr>
             <w:tcW w:w="7822" w:type="dxa"/>
-            <w:shd w:val="clear" w:color="auto" w:fill="auto"/>
           </w:tcPr>
           <w:p>
             <w:pPr>
@@ -3416,7 +3410,6 @@
         <w:tc>
           <w:tcPr>
             <w:tcW w:w="1699" w:type="dxa"/>
-            <w:shd w:val="clear" w:color="auto" w:fill="auto"/>
           </w:tcPr>
           <w:p>
             <w:pPr>
@@ -3430,7 +3423,6 @@
         <w:tc>
           <w:tcPr>
             <w:tcW w:w="7822" w:type="dxa"/>
-            <w:shd w:val="clear" w:color="auto" w:fill="auto"/>
           </w:tcPr>
           <w:p>
             <w:pPr>
@@ -3468,7 +3460,6 @@
         <w:tc>
           <w:tcPr>
             <w:tcW w:w="1699" w:type="dxa"/>
-            <w:shd w:val="clear" w:color="auto" w:fill="auto"/>
           </w:tcPr>
           <w:p>
             <w:pPr>
@@ -3483,7 +3474,6 @@
         <w:tc>
           <w:tcPr>
             <w:tcW w:w="7822" w:type="dxa"/>
-            <w:shd w:val="clear" w:color="auto" w:fill="auto"/>
             <w:vAlign w:val="center"/>
           </w:tcPr>
           <w:p>
@@ -3503,7 +3493,6 @@
         <w:tc>
           <w:tcPr>
             <w:tcW w:w="1699" w:type="dxa"/>
-            <w:shd w:val="clear" w:color="auto" w:fill="auto"/>
           </w:tcPr>
           <w:p>
             <w:pPr>
@@ -3517,7 +3506,6 @@
         <w:tc>
           <w:tcPr>
             <w:tcW w:w="7822" w:type="dxa"/>
-            <w:shd w:val="clear" w:color="auto" w:fill="auto"/>
             <w:vAlign w:val="center"/>
           </w:tcPr>
           <w:p>
@@ -3540,7 +3528,6 @@
         <w:tc>
           <w:tcPr>
             <w:tcW w:w="1699" w:type="dxa"/>
-            <w:shd w:val="clear" w:color="auto" w:fill="auto"/>
           </w:tcPr>
           <w:p>
             <w:pPr>
@@ -3554,7 +3541,6 @@
         <w:tc>
           <w:tcPr>
             <w:tcW w:w="7822" w:type="dxa"/>
-            <w:shd w:val="clear" w:color="auto" w:fill="auto"/>
             <w:vAlign w:val="center"/>
           </w:tcPr>
           <w:p>
@@ -3713,7 +3699,6 @@
         <w:tc>
           <w:tcPr>
             <w:tcW w:w="1699" w:type="dxa"/>
-            <w:shd w:val="clear" w:color="auto" w:fill="auto"/>
           </w:tcPr>
           <w:p>
             <w:pPr>
@@ -3727,7 +3712,6 @@
         <w:tc>
           <w:tcPr>
             <w:tcW w:w="7822" w:type="dxa"/>
-            <w:shd w:val="clear" w:color="auto" w:fill="auto"/>
           </w:tcPr>
           <w:p>
             <w:pPr>
@@ -5740,15 +5724,7 @@
         </w:rPr>
       </w:pPr>
       <w:r>
-        <w:t xml:space="preserve">No módulo de extração e tratamento de dados, foram concebidos quatro </w:t>
-      </w:r>
-      <w:proofErr w:type="spellStart"/>
-      <w:r>
-        <w:t>microsserviços</w:t>
-      </w:r>
-      <w:proofErr w:type="spellEnd"/>
-      <w:r>
-        <w:t xml:space="preserve">, destacando-se o </w:t>
+        <w:t xml:space="preserve">No módulo de extração e tratamento de dados, foram concebidos quatro microsserviços, destacando-se o </w:t>
       </w:r>
       <w:proofErr w:type="spellStart"/>
       <w:r>
@@ -7292,13 +7268,29 @@
             <w:proofErr w:type="spellEnd"/>
             <w:proofErr w:type="gramEnd"/>
             <w:r>
-              <w:t>(query={</w:t>
+              <w:t>(query</w:t>
+            </w:r>
+            <w:proofErr w:type="gramStart"/>
+            <w:r>
+              <w:t>={</w:t>
             </w:r>
             <w:r>
               <w:t xml:space="preserve"> </w:t>
             </w:r>
             <w:r>
-              <w:t>"street": row[2],</w:t>
+              <w:t>"</w:t>
+            </w:r>
+            <w:proofErr w:type="gramEnd"/>
+            <w:r>
+              <w:t xml:space="preserve">street": </w:t>
+            </w:r>
+            <w:proofErr w:type="gramStart"/>
+            <w:r>
+              <w:t>row[</w:t>
+            </w:r>
+            <w:proofErr w:type="gramEnd"/>
+            <w:r>
+              <w:t>2],</w:t>
             </w:r>
           </w:p>
           <w:p>
@@ -7367,10 +7359,12 @@
               <w:t xml:space="preserve">"latitude": </w:t>
             </w:r>
             <w:proofErr w:type="spellStart"/>
+            <w:proofErr w:type="gramStart"/>
             <w:r>
               <w:t>location.latitude</w:t>
             </w:r>
             <w:proofErr w:type="spellEnd"/>
+            <w:proofErr w:type="gramEnd"/>
             <w:r>
               <w:t>,</w:t>
             </w:r>
@@ -7945,10 +7939,12 @@
               <w:t>(), "</w:t>
             </w:r>
             <w:proofErr w:type="spellStart"/>
+            <w:proofErr w:type="gramStart"/>
             <w:r>
               <w:t>html.parser</w:t>
             </w:r>
             <w:proofErr w:type="spellEnd"/>
+            <w:proofErr w:type="gramEnd"/>
             <w:r>
               <w:t>")</w:t>
             </w:r>
@@ -7981,15 +7977,31 @@
             <w:proofErr w:type="spellEnd"/>
             <w:proofErr w:type="gramEnd"/>
             <w:r>
-              <w:t>('table', {"id": "</w:t>
+              <w:t>('table</w:t>
+            </w:r>
+            <w:proofErr w:type="gramStart"/>
+            <w:r>
+              <w:t>', {</w:t>
+            </w:r>
+            <w:proofErr w:type="gramEnd"/>
+            <w:r>
+              <w:t>"id": "</w:t>
             </w:r>
             <w:proofErr w:type="spellStart"/>
             <w:r>
-              <w:t>tabela_cotas</w:t>
+              <w:t>tabela_</w:t>
+            </w:r>
+            <w:proofErr w:type="gramStart"/>
+            <w:r>
+              <w:t>cotas</w:t>
             </w:r>
             <w:proofErr w:type="spellEnd"/>
             <w:r>
-              <w:t>"})</w:t>
+              <w:t>"}</w:t>
+            </w:r>
+            <w:proofErr w:type="gramEnd"/>
+            <w:r>
+              <w:t>)</w:t>
             </w:r>
           </w:p>
           <w:p>
@@ -8192,7 +8204,15 @@
             </w:r>
             <w:proofErr w:type="gramEnd"/>
             <w:r>
-              <w:t>2].replace(",", ".")</w:t>
+              <w:t>2</w:t>
+            </w:r>
+            <w:proofErr w:type="gramStart"/>
+            <w:r>
+              <w:t>].replace</w:t>
+            </w:r>
+            <w:proofErr w:type="gramEnd"/>
+            <w:r>
+              <w:t>(",", ".")</w:t>
             </w:r>
           </w:p>
           <w:p>
@@ -8273,7 +8293,15 @@
             <w:proofErr w:type="spellEnd"/>
             <w:proofErr w:type="gramEnd"/>
             <w:r>
-              <w:t>()]["</w:t>
+              <w:t>(</w:t>
+            </w:r>
+            <w:proofErr w:type="gramStart"/>
+            <w:r>
+              <w:t>)][</w:t>
+            </w:r>
+            <w:proofErr w:type="gramEnd"/>
+            <w:r>
+              <w:t>"</w:t>
             </w:r>
             <w:proofErr w:type="spellStart"/>
             <w:r>
@@ -8329,9 +8357,14 @@
             </w:r>
             <w:proofErr w:type="spellEnd"/>
             <w:r>
-              <w:t xml:space="preserve"> = f"{</w:t>
+              <w:t xml:space="preserve"> = </w:t>
+            </w:r>
+            <w:proofErr w:type="gramStart"/>
+            <w:r>
+              <w:t>f"{</w:t>
             </w:r>
             <w:proofErr w:type="spellStart"/>
+            <w:proofErr w:type="gramEnd"/>
             <w:r>
               <w:t>completed_</w:t>
             </w:r>
@@ -8342,15 +8375,28 @@
             <w:proofErr w:type="spellEnd"/>
             <w:proofErr w:type="gramEnd"/>
             <w:r>
-              <w:t>()};{</w:t>
+              <w:t>()</w:t>
+            </w:r>
+            <w:proofErr w:type="gramStart"/>
+            <w:r>
+              <w:t>};{</w:t>
             </w:r>
             <w:proofErr w:type="spellStart"/>
-            <w:r>
-              <w:t>flood_quota</w:t>
+            <w:proofErr w:type="gramEnd"/>
+            <w:r>
+              <w:t>flood_</w:t>
+            </w:r>
+            <w:proofErr w:type="gramStart"/>
+            <w:r>
+              <w:t>quota</w:t>
             </w:r>
             <w:proofErr w:type="spellEnd"/>
             <w:r>
-              <w:t>}\n"</w:t>
+              <w:t>}\</w:t>
+            </w:r>
+            <w:proofErr w:type="gramEnd"/>
+            <w:r>
+              <w:t>n"</w:t>
             </w:r>
           </w:p>
           <w:p>
@@ -9646,11 +9692,19 @@
             </w:r>
             <w:proofErr w:type="gramEnd"/>
             <w:r>
-              <w:t>_for_status</w:t>
+              <w:t>_for_</w:t>
+            </w:r>
+            <w:proofErr w:type="gramStart"/>
+            <w:r>
+              <w:t>status</w:t>
             </w:r>
             <w:proofErr w:type="spellEnd"/>
             <w:r>
-              <w:t>()</w:t>
+              <w:t>(</w:t>
+            </w:r>
+            <w:proofErr w:type="gramEnd"/>
+            <w:r>
+              <w:t>)</w:t>
             </w:r>
           </w:p>
           <w:p>
@@ -9700,7 +9754,15 @@
             </w:r>
             <w:proofErr w:type="gramEnd"/>
             <w:r>
-              <w:t>"result"]["listings"]:</w:t>
+              <w:t>"result</w:t>
+            </w:r>
+            <w:proofErr w:type="gramStart"/>
+            <w:r>
+              <w:t>"][</w:t>
+            </w:r>
+            <w:proofErr w:type="gramEnd"/>
+            <w:r>
+              <w:t>"listings"]:</w:t>
             </w:r>
           </w:p>
           <w:p>
@@ -9785,7 +9847,21 @@
               <w:rPr>
                 <w:lang w:val="pt-BR"/>
               </w:rPr>
-              <w:t>item['link']['</w:t>
+              <w:t>item['link</w:t>
+            </w:r>
+            <w:proofErr w:type="gramStart"/>
+            <w:r>
+              <w:rPr>
+                <w:lang w:val="pt-BR"/>
+              </w:rPr>
+              <w:t>'][</w:t>
+            </w:r>
+            <w:proofErr w:type="gramEnd"/>
+            <w:r>
+              <w:rPr>
+                <w:lang w:val="pt-BR"/>
+              </w:rPr>
+              <w:t>'</w:t>
             </w:r>
             <w:proofErr w:type="spellStart"/>
             <w:r>
@@ -9872,13 +9948,8 @@
             </w:r>
             <w:proofErr w:type="spellEnd"/>
             <w:r>
-              <w:t xml:space="preserve">": </w:t>
-            </w:r>
-            <w:proofErr w:type="gramStart"/>
-            <w:r>
-              <w:t>True</w:t>
-            </w:r>
-            <w:proofErr w:type="gramEnd"/>
+              <w:t>": True</w:t>
+            </w:r>
           </w:p>
           <w:p>
             <w:pPr>
@@ -9967,12 +10038,17 @@
               <w:t>=</w:t>
             </w:r>
             <w:proofErr w:type="spellStart"/>
+            <w:proofErr w:type="gramStart"/>
             <w:r>
               <w:t>datetime.now</w:t>
             </w:r>
             <w:proofErr w:type="spellEnd"/>
             <w:r>
-              <w:t>()</w:t>
+              <w:t>(</w:t>
+            </w:r>
+            <w:proofErr w:type="gramEnd"/>
+            <w:r>
+              <w:t>)</w:t>
             </w:r>
           </w:p>
           <w:p>
@@ -10004,7 +10080,15 @@
             </w:r>
             <w:proofErr w:type="gramEnd"/>
             <w:r>
-              <w:t>conn=conn, message=event)</w:t>
+              <w:t>conn=</w:t>
+            </w:r>
+            <w:proofErr w:type="gramStart"/>
+            <w:r>
+              <w:t>conn</w:t>
+            </w:r>
+            <w:proofErr w:type="gramEnd"/>
+            <w:r>
+              <w:t>, message=event)</w:t>
             </w:r>
           </w:p>
         </w:tc>
@@ -12642,31 +12726,15 @@
       </w:r>
       <w:proofErr w:type="spellEnd"/>
       <w:r>
-        <w:t xml:space="preserve">, flat, loft, sobrado, germinada, condomínio e </w:t>
+        <w:t xml:space="preserve">, flat, loft, sobrado, germinada, condomínio e kitnet. Os tipos </w:t>
       </w:r>
       <w:proofErr w:type="spellStart"/>
       <w:r>
-        <w:t>kitnet</w:t>
+        <w:t>penthouse</w:t>
       </w:r>
       <w:proofErr w:type="spellEnd"/>
       <w:r>
-        <w:t xml:space="preserve">. Os tipos </w:t>
-      </w:r>
-      <w:proofErr w:type="spellStart"/>
-      <w:r>
-        <w:t>penthouse</w:t>
-      </w:r>
-      <w:proofErr w:type="spellEnd"/>
-      <w:r>
-        <w:t xml:space="preserve">, flat, loft e </w:t>
-      </w:r>
-      <w:proofErr w:type="spellStart"/>
-      <w:r>
-        <w:t>kitnet</w:t>
-      </w:r>
-      <w:proofErr w:type="spellEnd"/>
-      <w:r>
-        <w:t xml:space="preserve"> foram convertidos em apartamento. Já sobrado, germinadas e condomínios em casa, a</w:t>
+        <w:t>, flat, loft e kitnet foram convertidos em apartamento. Já sobrado, germinadas e condomínios em casa, a</w:t>
       </w:r>
       <w:r>
         <w:t xml:space="preserve"> </w:t>
@@ -14557,21 +14625,12 @@
       <w:r>
         <w:t xml:space="preserve">O item 4 representa o parâmetro denominado </w:t>
       </w:r>
-      <w:proofErr w:type="spellStart"/>
       <w:r>
         <w:rPr>
           <w:i/>
           <w:iCs/>
         </w:rPr>
-        <w:t>learning</w:t>
-      </w:r>
-      <w:proofErr w:type="spellEnd"/>
-      <w:r>
-        <w:rPr>
-          <w:i/>
-          <w:iCs/>
-        </w:rPr>
-        <w:t xml:space="preserve"> rate</w:t>
+        <w:t>learning rate</w:t>
       </w:r>
       <w:r>
         <w:t>, responsável por calcular o ajuste dos pesos de cada ligação dos neurônios, já o item 5 representa a retropropagação que faz o ajuste dos pesos com base nos resultados da função de ativação.</w:t>
@@ -15157,11 +15216,11 @@
             </w:r>
             <w:proofErr w:type="spellEnd"/>
             <w:r>
-              <w:t>(</w:t>
+              <w:t>(Dense(</w:t>
             </w:r>
             <w:proofErr w:type="gramEnd"/>
             <w:r>
-              <w:t>Dense(units=</w:t>
+              <w:t>units=</w:t>
             </w:r>
             <w:proofErr w:type="spellStart"/>
             <w:r>
@@ -15199,11 +15258,11 @@
             </w:r>
             <w:proofErr w:type="spellEnd"/>
             <w:r>
-              <w:t>(</w:t>
+              <w:t>(Dense(</w:t>
             </w:r>
             <w:proofErr w:type="gramEnd"/>
             <w:r>
-              <w:t>Dense(units=1, activation="</w:t>
+              <w:t>units=1, activation="</w:t>
             </w:r>
             <w:proofErr w:type="spellStart"/>
             <w:r>
@@ -15310,8 +15369,13 @@
               <w:t xml:space="preserve">, </w:t>
             </w:r>
             <w:proofErr w:type="spellStart"/>
-            <w:r>
-              <w:t>self.y_properties_train</w:t>
+            <w:proofErr w:type="gramStart"/>
+            <w:r>
+              <w:t>self.y</w:t>
+            </w:r>
+            <w:proofErr w:type="gramEnd"/>
+            <w:r>
+              <w:t>_properties_train</w:t>
             </w:r>
             <w:proofErr w:type="spellEnd"/>
             <w:r>
@@ -15430,9 +15494,12 @@
               <w:t>(</w:t>
             </w:r>
             <w:proofErr w:type="spellStart"/>
+            <w:r>
+              <w:t>self.y</w:t>
+            </w:r>
             <w:proofErr w:type="gramEnd"/>
             <w:r>
-              <w:t>self.y_properties_test</w:t>
+              <w:t>_properties_test</w:t>
             </w:r>
             <w:proofErr w:type="spellEnd"/>
             <w:r>
@@ -15461,12 +15528,17 @@
             </w:r>
             <w:proofErr w:type="spellStart"/>
             <w:r>
-              <w:t>save_history</w:t>
+              <w:t>save_</w:t>
+            </w:r>
+            <w:proofErr w:type="gramStart"/>
+            <w:r>
+              <w:t>history</w:t>
             </w:r>
             <w:proofErr w:type="spellEnd"/>
             <w:r>
               <w:t>(</w:t>
             </w:r>
+            <w:proofErr w:type="gramEnd"/>
           </w:p>
           <w:p>
             <w:pPr>
@@ -15967,7 +16039,39 @@
             </w:r>
             <w:proofErr w:type="gramEnd"/>
             <w:r>
-              <w:t>,self.model_in_db.epochs,self.model_in_db.population_size)</w:t>
+              <w:t>,</w:t>
+            </w:r>
+            <w:proofErr w:type="gramStart"/>
+            <w:r>
+              <w:t>self.model</w:t>
+            </w:r>
+            <w:proofErr w:type="gramEnd"/>
+            <w:r>
+              <w:t>_in_</w:t>
+            </w:r>
+            <w:proofErr w:type="gramStart"/>
+            <w:r>
+              <w:t>db.epochs</w:t>
+            </w:r>
+            <w:proofErr w:type="gramEnd"/>
+            <w:r>
+              <w:t>,</w:t>
+            </w:r>
+            <w:proofErr w:type="gramStart"/>
+            <w:r>
+              <w:t>self.model</w:t>
+            </w:r>
+            <w:proofErr w:type="gramEnd"/>
+            <w:r>
+              <w:t>_in_</w:t>
+            </w:r>
+            <w:proofErr w:type="gramStart"/>
+            <w:r>
+              <w:t>db.population</w:t>
+            </w:r>
+            <w:proofErr w:type="gramEnd"/>
+            <w:r>
+              <w:t>_size)</w:t>
             </w:r>
           </w:p>
           <w:p>
@@ -21077,25 +21181,8 @@
         <w:pStyle w:val="TF-REFERNCIASITEM"/>
       </w:pPr>
       <w:r>
-        <w:rPr>
-          <w:lang w:val="en-US"/>
-        </w:rPr>
         <w:lastRenderedPageBreak/>
-        <w:t xml:space="preserve">CAMPOS, </w:t>
-      </w:r>
-      <w:proofErr w:type="spellStart"/>
-      <w:r>
-        <w:rPr>
-          <w:lang w:val="en-US"/>
-        </w:rPr>
-        <w:t>Suelen</w:t>
-      </w:r>
-      <w:proofErr w:type="spellEnd"/>
-      <w:r>
-        <w:rPr>
-          <w:lang w:val="en-US"/>
-        </w:rPr>
-        <w:t xml:space="preserve"> Ferreira. </w:t>
+        <w:t xml:space="preserve">CAMPOS, Suelen Ferreira. </w:t>
       </w:r>
       <w:r>
         <w:rPr>
@@ -21253,6 +21340,9 @@
     <w:p>
       <w:pPr>
         <w:pStyle w:val="TF-REFERNCIASITEM"/>
+        <w:rPr>
+          <w:lang w:val="en-US"/>
+        </w:rPr>
       </w:pPr>
       <w:r>
         <w:rPr>
@@ -21303,8 +21393,47 @@
       <w:r>
         <w:t xml:space="preserve">27i2.16. Disponível em: https://www.semanticscholar.org/paper/Comparison-of-property-price-development-in-regions-Čermáková-Hromada/44cd449bcc51a65cef30531556a2f8b289c9eb1c. </w:t>
       </w:r>
-      <w:r>
-        <w:t>Acesso em: 4 dez. 2023.</w:t>
+      <w:proofErr w:type="spellStart"/>
+      <w:r>
+        <w:rPr>
+          <w:lang w:val="en-US"/>
+        </w:rPr>
+        <w:t>Acesso</w:t>
+      </w:r>
+      <w:proofErr w:type="spellEnd"/>
+      <w:r>
+        <w:rPr>
+          <w:lang w:val="en-US"/>
+        </w:rPr>
+        <w:t xml:space="preserve"> </w:t>
+      </w:r>
+      <w:proofErr w:type="spellStart"/>
+      <w:r>
+        <w:rPr>
+          <w:lang w:val="en-US"/>
+        </w:rPr>
+        <w:t>em</w:t>
+      </w:r>
+      <w:proofErr w:type="spellEnd"/>
+      <w:r>
+        <w:rPr>
+          <w:lang w:val="en-US"/>
+        </w:rPr>
+        <w:t xml:space="preserve">: 4 </w:t>
+      </w:r>
+      <w:proofErr w:type="spellStart"/>
+      <w:r>
+        <w:rPr>
+          <w:lang w:val="en-US"/>
+        </w:rPr>
+        <w:t>dez</w:t>
+      </w:r>
+      <w:proofErr w:type="spellEnd"/>
+      <w:r>
+        <w:rPr>
+          <w:lang w:val="en-US"/>
+        </w:rPr>
+        <w:t>. 2023.</w:t>
       </w:r>
     </w:p>
     <w:p>
@@ -21764,6 +21893,7 @@
         <w:pStyle w:val="TF-REFERNCIASITEM"/>
         <w:rPr>
           <w:shd w:val="clear" w:color="auto" w:fill="FFFFFF"/>
+          <w:lang w:val="en-US"/>
         </w:rPr>
       </w:pPr>
       <w:r>
@@ -21831,7 +21961,55 @@
         <w:rPr>
           <w:shd w:val="clear" w:color="auto" w:fill="FFFFFF"/>
         </w:rPr>
-        <w:t>DOI https://doi.org/10.1016/j.eswa.2015.10.039. Disponível em: https://www.sciencedirect.com/science/article/abs/pii/S0957417415007435?via%3Dihub. Acesso em: 2 dez. 2023.</w:t>
+        <w:t xml:space="preserve">DOI https://doi.org/10.1016/j.eswa.2015.10.039. Disponível em: https://www.sciencedirect.com/science/article/abs/pii/S0957417415007435?via%3Dihub. </w:t>
+      </w:r>
+      <w:proofErr w:type="spellStart"/>
+      <w:r>
+        <w:rPr>
+          <w:shd w:val="clear" w:color="auto" w:fill="FFFFFF"/>
+          <w:lang w:val="en-US"/>
+        </w:rPr>
+        <w:t>Acesso</w:t>
+      </w:r>
+      <w:proofErr w:type="spellEnd"/>
+      <w:r>
+        <w:rPr>
+          <w:shd w:val="clear" w:color="auto" w:fill="FFFFFF"/>
+          <w:lang w:val="en-US"/>
+        </w:rPr>
+        <w:t xml:space="preserve"> </w:t>
+      </w:r>
+      <w:proofErr w:type="spellStart"/>
+      <w:r>
+        <w:rPr>
+          <w:shd w:val="clear" w:color="auto" w:fill="FFFFFF"/>
+          <w:lang w:val="en-US"/>
+        </w:rPr>
+        <w:t>em</w:t>
+      </w:r>
+      <w:proofErr w:type="spellEnd"/>
+      <w:r>
+        <w:rPr>
+          <w:shd w:val="clear" w:color="auto" w:fill="FFFFFF"/>
+          <w:lang w:val="en-US"/>
+        </w:rPr>
+        <w:t xml:space="preserve">: 2 </w:t>
+      </w:r>
+      <w:proofErr w:type="spellStart"/>
+      <w:r>
+        <w:rPr>
+          <w:shd w:val="clear" w:color="auto" w:fill="FFFFFF"/>
+          <w:lang w:val="en-US"/>
+        </w:rPr>
+        <w:t>dez</w:t>
+      </w:r>
+      <w:proofErr w:type="spellEnd"/>
+      <w:r>
+        <w:rPr>
+          <w:shd w:val="clear" w:color="auto" w:fill="FFFFFF"/>
+          <w:lang w:val="en-US"/>
+        </w:rPr>
+        <w:t>. 2023.</w:t>
       </w:r>
     </w:p>
     <w:p>
@@ -21839,25 +22017,15 @@
         <w:pStyle w:val="TF-REFERNCIASITEM"/>
         <w:rPr>
           <w:shd w:val="clear" w:color="auto" w:fill="FFFFFF"/>
+          <w:lang w:val="en-US"/>
         </w:rPr>
       </w:pPr>
       <w:r>
         <w:rPr>
           <w:shd w:val="clear" w:color="auto" w:fill="FFFFFF"/>
-        </w:rPr>
-        <w:t>MOREIRA</w:t>
-      </w:r>
-      <w:r>
-        <w:rPr>
-          <w:shd w:val="clear" w:color="auto" w:fill="FFFFFF"/>
-        </w:rPr>
-        <w:t xml:space="preserve"> et al</w:t>
-      </w:r>
-      <w:r>
-        <w:rPr>
-          <w:shd w:val="clear" w:color="auto" w:fill="FFFFFF"/>
-        </w:rPr>
-        <w:t xml:space="preserve">. RENTAL INCOME AND CAP RATES: A COMPARISON OF THE LISBON AND PORTO HOUSING MARKETS. </w:t>
+          <w:lang w:val="en-US"/>
+        </w:rPr>
+        <w:t xml:space="preserve">MOREIRA et al. RENTAL INCOME AND CAP RATES: A COMPARISON OF THE LISBON AND PORTO HOUSING MARKETS. </w:t>
       </w:r>
       <w:r>
         <w:rPr>
@@ -21895,7 +22063,55 @@
         <w:rPr>
           <w:shd w:val="clear" w:color="auto" w:fill="FFFFFF"/>
         </w:rPr>
-        <w:t>DOI https://doi.org/10.37043/JURA.2016.8.2.5. Disponível em: http://www.jurareview.ro/chapters/get_chapter/93. Acesso em: 4 dez. 2023.</w:t>
+        <w:t xml:space="preserve">DOI https://doi.org/10.37043/JURA.2016.8.2.5. Disponível em: http://www.jurareview.ro/chapters/get_chapter/93. </w:t>
+      </w:r>
+      <w:proofErr w:type="spellStart"/>
+      <w:r>
+        <w:rPr>
+          <w:shd w:val="clear" w:color="auto" w:fill="FFFFFF"/>
+          <w:lang w:val="en-US"/>
+        </w:rPr>
+        <w:t>Acesso</w:t>
+      </w:r>
+      <w:proofErr w:type="spellEnd"/>
+      <w:r>
+        <w:rPr>
+          <w:shd w:val="clear" w:color="auto" w:fill="FFFFFF"/>
+          <w:lang w:val="en-US"/>
+        </w:rPr>
+        <w:t xml:space="preserve"> </w:t>
+      </w:r>
+      <w:proofErr w:type="spellStart"/>
+      <w:r>
+        <w:rPr>
+          <w:shd w:val="clear" w:color="auto" w:fill="FFFFFF"/>
+          <w:lang w:val="en-US"/>
+        </w:rPr>
+        <w:t>em</w:t>
+      </w:r>
+      <w:proofErr w:type="spellEnd"/>
+      <w:r>
+        <w:rPr>
+          <w:shd w:val="clear" w:color="auto" w:fill="FFFFFF"/>
+          <w:lang w:val="en-US"/>
+        </w:rPr>
+        <w:t xml:space="preserve">: 4 </w:t>
+      </w:r>
+      <w:proofErr w:type="spellStart"/>
+      <w:r>
+        <w:rPr>
+          <w:shd w:val="clear" w:color="auto" w:fill="FFFFFF"/>
+          <w:lang w:val="en-US"/>
+        </w:rPr>
+        <w:t>dez</w:t>
+      </w:r>
+      <w:proofErr w:type="spellEnd"/>
+      <w:r>
+        <w:rPr>
+          <w:shd w:val="clear" w:color="auto" w:fill="FFFFFF"/>
+          <w:lang w:val="en-US"/>
+        </w:rPr>
+        <w:t>. 2023.</w:t>
       </w:r>
     </w:p>
     <w:p>
@@ -22160,6 +22376,7 @@
         <w:pStyle w:val="TF-REFERNCIASITEM"/>
         <w:rPr>
           <w:shd w:val="clear" w:color="auto" w:fill="FFFFFF"/>
+          <w:lang w:val="en-US"/>
         </w:rPr>
       </w:pPr>
       <w:r>
@@ -22186,7 +22403,23 @@
         <w:rPr>
           <w:shd w:val="clear" w:color="auto" w:fill="FFFFFF"/>
         </w:rPr>
-        <w:t>. Prefeitura Municipal de Blumenau, Blumenau, 2020.</w:t>
+        <w:t xml:space="preserve">. </w:t>
+      </w:r>
+      <w:proofErr w:type="spellStart"/>
+      <w:r>
+        <w:rPr>
+          <w:shd w:val="clear" w:color="auto" w:fill="FFFFFF"/>
+          <w:lang w:val="en-US"/>
+        </w:rPr>
+        <w:t>Prefeitura</w:t>
+      </w:r>
+      <w:proofErr w:type="spellEnd"/>
+      <w:r>
+        <w:rPr>
+          <w:shd w:val="clear" w:color="auto" w:fill="FFFFFF"/>
+          <w:lang w:val="en-US"/>
+        </w:rPr>
+        <w:t xml:space="preserve"> Municipal de Blumenau, Blumenau, 2020.</w:t>
       </w:r>
     </w:p>
     <w:p>
@@ -22504,27 +22737,15 @@
         <w:pStyle w:val="TF-REFERNCIASITEM"/>
         <w:rPr>
           <w:shd w:val="clear" w:color="auto" w:fill="FFFFFF"/>
+          <w:lang w:val="en-US"/>
         </w:rPr>
       </w:pPr>
       <w:r>
         <w:rPr>
           <w:shd w:val="clear" w:color="auto" w:fill="FFFFFF"/>
-        </w:rPr>
-        <w:t xml:space="preserve">TRINH, </w:t>
-      </w:r>
-      <w:proofErr w:type="spellStart"/>
-      <w:r>
-        <w:rPr>
-          <w:shd w:val="clear" w:color="auto" w:fill="FFFFFF"/>
-        </w:rPr>
-        <w:t>Truong</w:t>
-      </w:r>
-      <w:proofErr w:type="spellEnd"/>
-      <w:r>
-        <w:rPr>
-          <w:shd w:val="clear" w:color="auto" w:fill="FFFFFF"/>
-        </w:rPr>
-        <w:t xml:space="preserve"> Hong. </w:t>
+          <w:lang w:val="en-US"/>
+        </w:rPr>
+        <w:t xml:space="preserve">TRINH, Truong Hong. </w:t>
       </w:r>
       <w:r>
         <w:rPr>
@@ -22553,7 +22774,55 @@
         <w:rPr>
           <w:shd w:val="clear" w:color="auto" w:fill="FFFFFF"/>
         </w:rPr>
-        <w:t>DOI https://doi.org/10.1080/23311975.2022.2132590. Disponível em: https://www.tandfonline.com/doi/full/10.1080/23311975.2022.2132590?scroll=top&amp;needAccess=true. Acesso em: 4 dez. 2023.</w:t>
+        <w:t xml:space="preserve">DOI https://doi.org/10.1080/23311975.2022.2132590. Disponível em: https://www.tandfonline.com/doi/full/10.1080/23311975.2022.2132590?scroll=top&amp;needAccess=true. </w:t>
+      </w:r>
+      <w:proofErr w:type="spellStart"/>
+      <w:r>
+        <w:rPr>
+          <w:shd w:val="clear" w:color="auto" w:fill="FFFFFF"/>
+          <w:lang w:val="en-US"/>
+        </w:rPr>
+        <w:t>Acesso</w:t>
+      </w:r>
+      <w:proofErr w:type="spellEnd"/>
+      <w:r>
+        <w:rPr>
+          <w:shd w:val="clear" w:color="auto" w:fill="FFFFFF"/>
+          <w:lang w:val="en-US"/>
+        </w:rPr>
+        <w:t xml:space="preserve"> </w:t>
+      </w:r>
+      <w:proofErr w:type="spellStart"/>
+      <w:r>
+        <w:rPr>
+          <w:shd w:val="clear" w:color="auto" w:fill="FFFFFF"/>
+          <w:lang w:val="en-US"/>
+        </w:rPr>
+        <w:t>em</w:t>
+      </w:r>
+      <w:proofErr w:type="spellEnd"/>
+      <w:r>
+        <w:rPr>
+          <w:shd w:val="clear" w:color="auto" w:fill="FFFFFF"/>
+          <w:lang w:val="en-US"/>
+        </w:rPr>
+        <w:t xml:space="preserve">: 4 </w:t>
+      </w:r>
+      <w:proofErr w:type="spellStart"/>
+      <w:r>
+        <w:rPr>
+          <w:shd w:val="clear" w:color="auto" w:fill="FFFFFF"/>
+          <w:lang w:val="en-US"/>
+        </w:rPr>
+        <w:t>dez</w:t>
+      </w:r>
+      <w:proofErr w:type="spellEnd"/>
+      <w:r>
+        <w:rPr>
+          <w:shd w:val="clear" w:color="auto" w:fill="FFFFFF"/>
+          <w:lang w:val="en-US"/>
+        </w:rPr>
+        <w:t>. 2023.</w:t>
       </w:r>
     </w:p>
     <w:p>
@@ -22567,6 +22836,7 @@
       <w:r>
         <w:rPr>
           <w:shd w:val="clear" w:color="auto" w:fill="FFFFFF"/>
+          <w:lang w:val="en-US"/>
         </w:rPr>
         <w:t xml:space="preserve">ZHENG, </w:t>
       </w:r>
@@ -22574,6 +22844,7 @@
       <w:r>
         <w:rPr>
           <w:shd w:val="clear" w:color="auto" w:fill="FFFFFF"/>
+          <w:lang w:val="en-US"/>
         </w:rPr>
         <w:t>Yikai</w:t>
       </w:r>
@@ -22581,6 +22852,7 @@
       <w:r>
         <w:rPr>
           <w:shd w:val="clear" w:color="auto" w:fill="FFFFFF"/>
+          <w:lang w:val="en-US"/>
         </w:rPr>
         <w:t> </w:t>
       </w:r>
@@ -22589,12 +22861,14 @@
           <w:i/>
           <w:iCs/>
           <w:shd w:val="clear" w:color="auto" w:fill="FFFFFF"/>
+          <w:lang w:val="en-US"/>
         </w:rPr>
         <w:t>et al</w:t>
       </w:r>
       <w:r>
         <w:rPr>
           <w:shd w:val="clear" w:color="auto" w:fill="FFFFFF"/>
+          <w:lang w:val="en-US"/>
         </w:rPr>
         <w:t xml:space="preserve">. </w:t>
       </w:r>
@@ -22654,7 +22928,7 @@
 </file>
 
 <file path=word/endnotes.xml><?xml version="1.0" encoding="utf-8"?>
-<w:endnotes xmlns:wpc="http://schemas.microsoft.com/office/word/2010/wordprocessingCanvas" xmlns:cx="http://schemas.microsoft.com/office/drawing/2014/chartex" xmlns:cx1="http://schemas.microsoft.com/office/drawing/2015/9/8/chartex" xmlns:cx2="http://schemas.microsoft.com/office/drawing/2015/10/21/chartex" xmlns:cx3="http://schemas.microsoft.com/office/drawing/2016/5/9/chartex" xmlns:cx4="http://schemas.microsoft.com/office/drawing/2016/5/10/chartex" xmlns:cx5="http://schemas.microsoft.com/office/drawing/2016/5/11/chartex" xmlns:cx6="http://schemas.microsoft.com/office/drawing/2016/5/12/chartex" xmlns:cx7="http://schemas.microsoft.com/office/drawing/2016/5/13/chartex" xmlns:cx8="http://schemas.microsoft.com/office/drawing/2016/5/14/chartex" xmlns:mc="http://schemas.openxmlformats.org/markup-compatibility/2006" xmlns:aink="http://schemas.microsoft.com/office/drawing/2016/ink" xmlns:am3d="http://schemas.microsoft.com/office/drawing/2017/model3d" xmlns:o="urn:schemas-microsoft-com:office:office" xmlns:oel="http://schemas.microsoft.com/office/2019/extlst" xmlns:r="http://schemas.openxmlformats.org/officeDocument/2006/relationships" xmlns:m="http://schemas.openxmlformats.org/officeDocument/2006/math" xmlns:v="urn:schemas-microsoft-com:vml" xmlns:wp14="http://schemas.microsoft.com/office/word/2010/wordprocessingDrawing" xmlns:wp="http://schemas.openxmlformats.org/drawingml/2006/wordprocessingDrawing" xmlns:w10="urn:schemas-microsoft-com:office:word" xmlns:w="http://schemas.openxmlformats.org/wordprocessingml/2006/main" xmlns:w14="http://schemas.microsoft.com/office/word/2010/wordml" xmlns:w15="http://schemas.microsoft.com/office/word/2012/wordml" xmlns:w16cex="http://schemas.microsoft.com/office/word/2018/wordml/cex" xmlns:w16cid="http://schemas.microsoft.com/office/word/2016/wordml/cid" xmlns:w16="http://schemas.microsoft.com/office/word/2018/wordml" xmlns:w16sdtdh="http://schemas.microsoft.com/office/word/2020/wordml/sdtdatahash" xmlns:w16se="http://schemas.microsoft.com/office/word/2015/wordml/symex" xmlns:wpg="http://schemas.microsoft.com/office/word/2010/wordprocessingGroup" xmlns:wpi="http://schemas.microsoft.com/office/word/2010/wordprocessingInk" xmlns:wne="http://schemas.microsoft.com/office/word/2006/wordml" xmlns:wps="http://schemas.microsoft.com/office/word/2010/wordprocessingShape" mc:Ignorable="w14 w15 w16se w16cid w16 w16cex w16sdtdh wp14">
+<w:endnotes xmlns:wpc="http://schemas.microsoft.com/office/word/2010/wordprocessingCanvas" xmlns:cx="http://schemas.microsoft.com/office/drawing/2014/chartex" xmlns:cx1="http://schemas.microsoft.com/office/drawing/2015/9/8/chartex" xmlns:cx2="http://schemas.microsoft.com/office/drawing/2015/10/21/chartex" xmlns:cx3="http://schemas.microsoft.com/office/drawing/2016/5/9/chartex" xmlns:cx4="http://schemas.microsoft.com/office/drawing/2016/5/10/chartex" xmlns:cx5="http://schemas.microsoft.com/office/drawing/2016/5/11/chartex" xmlns:cx6="http://schemas.microsoft.com/office/drawing/2016/5/12/chartex" xmlns:cx7="http://schemas.microsoft.com/office/drawing/2016/5/13/chartex" xmlns:cx8="http://schemas.microsoft.com/office/drawing/2016/5/14/chartex" xmlns:mc="http://schemas.openxmlformats.org/markup-compatibility/2006" xmlns:aink="http://schemas.microsoft.com/office/drawing/2016/ink" xmlns:am3d="http://schemas.microsoft.com/office/drawing/2017/model3d" xmlns:o="urn:schemas-microsoft-com:office:office" xmlns:oel="http://schemas.microsoft.com/office/2019/extlst" xmlns:r="http://schemas.openxmlformats.org/officeDocument/2006/relationships" xmlns:m="http://schemas.openxmlformats.org/officeDocument/2006/math" xmlns:v="urn:schemas-microsoft-com:vml" xmlns:wp14="http://schemas.microsoft.com/office/word/2010/wordprocessingDrawing" xmlns:wp="http://schemas.openxmlformats.org/drawingml/2006/wordprocessingDrawing" xmlns:w10="urn:schemas-microsoft-com:office:word" xmlns:w="http://schemas.openxmlformats.org/wordprocessingml/2006/main" xmlns:w14="http://schemas.microsoft.com/office/word/2010/wordml" xmlns:w15="http://schemas.microsoft.com/office/word/2012/wordml" xmlns:w16cex="http://schemas.microsoft.com/office/word/2018/wordml/cex" xmlns:w16cid="http://schemas.microsoft.com/office/word/2016/wordml/cid" xmlns:w16="http://schemas.microsoft.com/office/word/2018/wordml" xmlns:w16du="http://schemas.microsoft.com/office/word/2023/wordml/word16du" xmlns:w16sdtdh="http://schemas.microsoft.com/office/word/2020/wordml/sdtdatahash" xmlns:w16sdtfl="http://schemas.microsoft.com/office/word/2024/wordml/sdtformatlock" xmlns:w16se="http://schemas.microsoft.com/office/word/2015/wordml/symex" xmlns:wpg="http://schemas.microsoft.com/office/word/2010/wordprocessingGroup" xmlns:wpi="http://schemas.microsoft.com/office/word/2010/wordprocessingInk" xmlns:wne="http://schemas.microsoft.com/office/word/2006/wordml" xmlns:wps="http://schemas.microsoft.com/office/word/2010/wordprocessingShape" mc:Ignorable="w14 w15 w16se w16cid w16 w16cex w16sdtdh w16sdtfl w16du wp14">
   <w:endnote w:type="separator" w:id="-1">
     <w:p>
       <w:r>
@@ -22678,7 +22952,7 @@
 </file>
 
 <file path=word/footer1.xml><?xml version="1.0" encoding="utf-8"?>
-<w:ftr xmlns:wpc="http://schemas.microsoft.com/office/word/2010/wordprocessingCanvas" xmlns:cx="http://schemas.microsoft.com/office/drawing/2014/chartex" xmlns:cx1="http://schemas.microsoft.com/office/drawing/2015/9/8/chartex" xmlns:cx2="http://schemas.microsoft.com/office/drawing/2015/10/21/chartex" xmlns:cx3="http://schemas.microsoft.com/office/drawing/2016/5/9/chartex" xmlns:cx4="http://schemas.microsoft.com/office/drawing/2016/5/10/chartex" xmlns:cx5="http://schemas.microsoft.com/office/drawing/2016/5/11/chartex" xmlns:cx6="http://schemas.microsoft.com/office/drawing/2016/5/12/chartex" xmlns:cx7="http://schemas.microsoft.com/office/drawing/2016/5/13/chartex" xmlns:cx8="http://schemas.microsoft.com/office/drawing/2016/5/14/chartex" xmlns:mc="http://schemas.openxmlformats.org/markup-compatibility/2006" xmlns:aink="http://schemas.microsoft.com/office/drawing/2016/ink" xmlns:am3d="http://schemas.microsoft.com/office/drawing/2017/model3d" xmlns:o="urn:schemas-microsoft-com:office:office" xmlns:oel="http://schemas.microsoft.com/office/2019/extlst" xmlns:r="http://schemas.openxmlformats.org/officeDocument/2006/relationships" xmlns:m="http://schemas.openxmlformats.org/officeDocument/2006/math" xmlns:v="urn:schemas-microsoft-com:vml" xmlns:wp14="http://schemas.microsoft.com/office/word/2010/wordprocessingDrawing" xmlns:wp="http://schemas.openxmlformats.org/drawingml/2006/wordprocessingDrawing" xmlns:w10="urn:schemas-microsoft-com:office:word" xmlns:w="http://schemas.openxmlformats.org/wordprocessingml/2006/main" xmlns:w14="http://schemas.microsoft.com/office/word/2010/wordml" xmlns:w15="http://schemas.microsoft.com/office/word/2012/wordml" xmlns:w16cex="http://schemas.microsoft.com/office/word/2018/wordml/cex" xmlns:w16cid="http://schemas.microsoft.com/office/word/2016/wordml/cid" xmlns:w16="http://schemas.microsoft.com/office/word/2018/wordml" xmlns:w16sdtdh="http://schemas.microsoft.com/office/word/2020/wordml/sdtdatahash" xmlns:w16se="http://schemas.microsoft.com/office/word/2015/wordml/symex" xmlns:wpg="http://schemas.microsoft.com/office/word/2010/wordprocessingGroup" xmlns:wpi="http://schemas.microsoft.com/office/word/2010/wordprocessingInk" xmlns:wne="http://schemas.microsoft.com/office/word/2006/wordml" xmlns:wps="http://schemas.microsoft.com/office/word/2010/wordprocessingShape" mc:Ignorable="w14 w15 w16se w16cid w16 w16cex w16sdtdh wp14">
+<w:ftr xmlns:wpc="http://schemas.microsoft.com/office/word/2010/wordprocessingCanvas" xmlns:cx="http://schemas.microsoft.com/office/drawing/2014/chartex" xmlns:cx1="http://schemas.microsoft.com/office/drawing/2015/9/8/chartex" xmlns:cx2="http://schemas.microsoft.com/office/drawing/2015/10/21/chartex" xmlns:cx3="http://schemas.microsoft.com/office/drawing/2016/5/9/chartex" xmlns:cx4="http://schemas.microsoft.com/office/drawing/2016/5/10/chartex" xmlns:cx5="http://schemas.microsoft.com/office/drawing/2016/5/11/chartex" xmlns:cx6="http://schemas.microsoft.com/office/drawing/2016/5/12/chartex" xmlns:cx7="http://schemas.microsoft.com/office/drawing/2016/5/13/chartex" xmlns:cx8="http://schemas.microsoft.com/office/drawing/2016/5/14/chartex" xmlns:mc="http://schemas.openxmlformats.org/markup-compatibility/2006" xmlns:aink="http://schemas.microsoft.com/office/drawing/2016/ink" xmlns:am3d="http://schemas.microsoft.com/office/drawing/2017/model3d" xmlns:o="urn:schemas-microsoft-com:office:office" xmlns:oel="http://schemas.microsoft.com/office/2019/extlst" xmlns:r="http://schemas.openxmlformats.org/officeDocument/2006/relationships" xmlns:m="http://schemas.openxmlformats.org/officeDocument/2006/math" xmlns:v="urn:schemas-microsoft-com:vml" xmlns:wp14="http://schemas.microsoft.com/office/word/2010/wordprocessingDrawing" xmlns:wp="http://schemas.openxmlformats.org/drawingml/2006/wordprocessingDrawing" xmlns:w10="urn:schemas-microsoft-com:office:word" xmlns:w="http://schemas.openxmlformats.org/wordprocessingml/2006/main" xmlns:w14="http://schemas.microsoft.com/office/word/2010/wordml" xmlns:w15="http://schemas.microsoft.com/office/word/2012/wordml" xmlns:w16cex="http://schemas.microsoft.com/office/word/2018/wordml/cex" xmlns:w16cid="http://schemas.microsoft.com/office/word/2016/wordml/cid" xmlns:w16="http://schemas.microsoft.com/office/word/2018/wordml" xmlns:w16du="http://schemas.microsoft.com/office/word/2023/wordml/word16du" xmlns:w16sdtdh="http://schemas.microsoft.com/office/word/2020/wordml/sdtdatahash" xmlns:w16sdtfl="http://schemas.microsoft.com/office/word/2024/wordml/sdtformatlock" xmlns:w16se="http://schemas.microsoft.com/office/word/2015/wordml/symex" xmlns:wpg="http://schemas.microsoft.com/office/word/2010/wordprocessingGroup" xmlns:wpi="http://schemas.microsoft.com/office/word/2010/wordprocessingInk" xmlns:wne="http://schemas.microsoft.com/office/word/2006/wordml" xmlns:wps="http://schemas.microsoft.com/office/word/2010/wordprocessingShape" mc:Ignorable="w14 w15 w16se w16cid w16 w16cex w16sdtdh w16sdtfl w16du wp14">
   <w:p>
     <w:pPr>
       <w:pStyle w:val="Rodap"/>
@@ -22767,7 +23041,7 @@
 </file>
 
 <file path=word/footer2.xml><?xml version="1.0" encoding="utf-8"?>
-<w:ftr xmlns:wpc="http://schemas.microsoft.com/office/word/2010/wordprocessingCanvas" xmlns:cx="http://schemas.microsoft.com/office/drawing/2014/chartex" xmlns:cx1="http://schemas.microsoft.com/office/drawing/2015/9/8/chartex" xmlns:cx2="http://schemas.microsoft.com/office/drawing/2015/10/21/chartex" xmlns:cx3="http://schemas.microsoft.com/office/drawing/2016/5/9/chartex" xmlns:cx4="http://schemas.microsoft.com/office/drawing/2016/5/10/chartex" xmlns:cx5="http://schemas.microsoft.com/office/drawing/2016/5/11/chartex" xmlns:cx6="http://schemas.microsoft.com/office/drawing/2016/5/12/chartex" xmlns:cx7="http://schemas.microsoft.com/office/drawing/2016/5/13/chartex" xmlns:cx8="http://schemas.microsoft.com/office/drawing/2016/5/14/chartex" xmlns:mc="http://schemas.openxmlformats.org/markup-compatibility/2006" xmlns:aink="http://schemas.microsoft.com/office/drawing/2016/ink" xmlns:am3d="http://schemas.microsoft.com/office/drawing/2017/model3d" xmlns:o="urn:schemas-microsoft-com:office:office" xmlns:oel="http://schemas.microsoft.com/office/2019/extlst" xmlns:r="http://schemas.openxmlformats.org/officeDocument/2006/relationships" xmlns:m="http://schemas.openxmlformats.org/officeDocument/2006/math" xmlns:v="urn:schemas-microsoft-com:vml" xmlns:wp14="http://schemas.microsoft.com/office/word/2010/wordprocessingDrawing" xmlns:wp="http://schemas.openxmlformats.org/drawingml/2006/wordprocessingDrawing" xmlns:w10="urn:schemas-microsoft-com:office:word" xmlns:w="http://schemas.openxmlformats.org/wordprocessingml/2006/main" xmlns:w14="http://schemas.microsoft.com/office/word/2010/wordml" xmlns:w15="http://schemas.microsoft.com/office/word/2012/wordml" xmlns:w16cex="http://schemas.microsoft.com/office/word/2018/wordml/cex" xmlns:w16cid="http://schemas.microsoft.com/office/word/2016/wordml/cid" xmlns:w16="http://schemas.microsoft.com/office/word/2018/wordml" xmlns:w16sdtdh="http://schemas.microsoft.com/office/word/2020/wordml/sdtdatahash" xmlns:w16se="http://schemas.microsoft.com/office/word/2015/wordml/symex" xmlns:wpg="http://schemas.microsoft.com/office/word/2010/wordprocessingGroup" xmlns:wpi="http://schemas.microsoft.com/office/word/2010/wordprocessingInk" xmlns:wne="http://schemas.microsoft.com/office/word/2006/wordml" xmlns:wps="http://schemas.microsoft.com/office/word/2010/wordprocessingShape" mc:Ignorable="w14 w15 w16se w16cid w16 w16cex w16sdtdh wp14">
+<w:ftr xmlns:wpc="http://schemas.microsoft.com/office/word/2010/wordprocessingCanvas" xmlns:cx="http://schemas.microsoft.com/office/drawing/2014/chartex" xmlns:cx1="http://schemas.microsoft.com/office/drawing/2015/9/8/chartex" xmlns:cx2="http://schemas.microsoft.com/office/drawing/2015/10/21/chartex" xmlns:cx3="http://schemas.microsoft.com/office/drawing/2016/5/9/chartex" xmlns:cx4="http://schemas.microsoft.com/office/drawing/2016/5/10/chartex" xmlns:cx5="http://schemas.microsoft.com/office/drawing/2016/5/11/chartex" xmlns:cx6="http://schemas.microsoft.com/office/drawing/2016/5/12/chartex" xmlns:cx7="http://schemas.microsoft.com/office/drawing/2016/5/13/chartex" xmlns:cx8="http://schemas.microsoft.com/office/drawing/2016/5/14/chartex" xmlns:mc="http://schemas.openxmlformats.org/markup-compatibility/2006" xmlns:aink="http://schemas.microsoft.com/office/drawing/2016/ink" xmlns:am3d="http://schemas.microsoft.com/office/drawing/2017/model3d" xmlns:o="urn:schemas-microsoft-com:office:office" xmlns:oel="http://schemas.microsoft.com/office/2019/extlst" xmlns:r="http://schemas.openxmlformats.org/officeDocument/2006/relationships" xmlns:m="http://schemas.openxmlformats.org/officeDocument/2006/math" xmlns:v="urn:schemas-microsoft-com:vml" xmlns:wp14="http://schemas.microsoft.com/office/word/2010/wordprocessingDrawing" xmlns:wp="http://schemas.openxmlformats.org/drawingml/2006/wordprocessingDrawing" xmlns:w10="urn:schemas-microsoft-com:office:word" xmlns:w="http://schemas.openxmlformats.org/wordprocessingml/2006/main" xmlns:w14="http://schemas.microsoft.com/office/word/2010/wordml" xmlns:w15="http://schemas.microsoft.com/office/word/2012/wordml" xmlns:w16cex="http://schemas.microsoft.com/office/word/2018/wordml/cex" xmlns:w16cid="http://schemas.microsoft.com/office/word/2016/wordml/cid" xmlns:w16="http://schemas.microsoft.com/office/word/2018/wordml" xmlns:w16du="http://schemas.microsoft.com/office/word/2023/wordml/word16du" xmlns:w16sdtdh="http://schemas.microsoft.com/office/word/2020/wordml/sdtdatahash" xmlns:w16sdtfl="http://schemas.microsoft.com/office/word/2024/wordml/sdtformatlock" xmlns:w16se="http://schemas.microsoft.com/office/word/2015/wordml/symex" xmlns:wpg="http://schemas.microsoft.com/office/word/2010/wordprocessingGroup" xmlns:wpi="http://schemas.microsoft.com/office/word/2010/wordprocessingInk" xmlns:wne="http://schemas.microsoft.com/office/word/2006/wordml" xmlns:wps="http://schemas.microsoft.com/office/word/2010/wordprocessingShape" mc:Ignorable="w14 w15 w16se w16cid w16 w16cex w16sdtdh w16sdtfl w16du wp14">
   <w:p>
     <w:pPr>
       <w:pStyle w:val="Rodap"/>
@@ -22838,7 +23112,7 @@
 </file>
 
 <file path=word/footnotes.xml><?xml version="1.0" encoding="utf-8"?>
-<w:footnotes xmlns:wpc="http://schemas.microsoft.com/office/word/2010/wordprocessingCanvas" xmlns:cx="http://schemas.microsoft.com/office/drawing/2014/chartex" xmlns:cx1="http://schemas.microsoft.com/office/drawing/2015/9/8/chartex" xmlns:cx2="http://schemas.microsoft.com/office/drawing/2015/10/21/chartex" xmlns:cx3="http://schemas.microsoft.com/office/drawing/2016/5/9/chartex" xmlns:cx4="http://schemas.microsoft.com/office/drawing/2016/5/10/chartex" xmlns:cx5="http://schemas.microsoft.com/office/drawing/2016/5/11/chartex" xmlns:cx6="http://schemas.microsoft.com/office/drawing/2016/5/12/chartex" xmlns:cx7="http://schemas.microsoft.com/office/drawing/2016/5/13/chartex" xmlns:cx8="http://schemas.microsoft.com/office/drawing/2016/5/14/chartex" xmlns:mc="http://schemas.openxmlformats.org/markup-compatibility/2006" xmlns:aink="http://schemas.microsoft.com/office/drawing/2016/ink" xmlns:am3d="http://schemas.microsoft.com/office/drawing/2017/model3d" xmlns:o="urn:schemas-microsoft-com:office:office" xmlns:oel="http://schemas.microsoft.com/office/2019/extlst" xmlns:r="http://schemas.openxmlformats.org/officeDocument/2006/relationships" xmlns:m="http://schemas.openxmlformats.org/officeDocument/2006/math" xmlns:v="urn:schemas-microsoft-com:vml" xmlns:wp14="http://schemas.microsoft.com/office/word/2010/wordprocessingDrawing" xmlns:wp="http://schemas.openxmlformats.org/drawingml/2006/wordprocessingDrawing" xmlns:w10="urn:schemas-microsoft-com:office:word" xmlns:w="http://schemas.openxmlformats.org/wordprocessingml/2006/main" xmlns:w14="http://schemas.microsoft.com/office/word/2010/wordml" xmlns:w15="http://schemas.microsoft.com/office/word/2012/wordml" xmlns:w16cex="http://schemas.microsoft.com/office/word/2018/wordml/cex" xmlns:w16cid="http://schemas.microsoft.com/office/word/2016/wordml/cid" xmlns:w16="http://schemas.microsoft.com/office/word/2018/wordml" xmlns:w16sdtdh="http://schemas.microsoft.com/office/word/2020/wordml/sdtdatahash" xmlns:w16se="http://schemas.microsoft.com/office/word/2015/wordml/symex" xmlns:wpg="http://schemas.microsoft.com/office/word/2010/wordprocessingGroup" xmlns:wpi="http://schemas.microsoft.com/office/word/2010/wordprocessingInk" xmlns:wne="http://schemas.microsoft.com/office/word/2006/wordml" xmlns:wps="http://schemas.microsoft.com/office/word/2010/wordprocessingShape" mc:Ignorable="w14 w15 w16se w16cid w16 w16cex w16sdtdh wp14">
+<w:footnotes xmlns:wpc="http://schemas.microsoft.com/office/word/2010/wordprocessingCanvas" xmlns:cx="http://schemas.microsoft.com/office/drawing/2014/chartex" xmlns:cx1="http://schemas.microsoft.com/office/drawing/2015/9/8/chartex" xmlns:cx2="http://schemas.microsoft.com/office/drawing/2015/10/21/chartex" xmlns:cx3="http://schemas.microsoft.com/office/drawing/2016/5/9/chartex" xmlns:cx4="http://schemas.microsoft.com/office/drawing/2016/5/10/chartex" xmlns:cx5="http://schemas.microsoft.com/office/drawing/2016/5/11/chartex" xmlns:cx6="http://schemas.microsoft.com/office/drawing/2016/5/12/chartex" xmlns:cx7="http://schemas.microsoft.com/office/drawing/2016/5/13/chartex" xmlns:cx8="http://schemas.microsoft.com/office/drawing/2016/5/14/chartex" xmlns:mc="http://schemas.openxmlformats.org/markup-compatibility/2006" xmlns:aink="http://schemas.microsoft.com/office/drawing/2016/ink" xmlns:am3d="http://schemas.microsoft.com/office/drawing/2017/model3d" xmlns:o="urn:schemas-microsoft-com:office:office" xmlns:oel="http://schemas.microsoft.com/office/2019/extlst" xmlns:r="http://schemas.openxmlformats.org/officeDocument/2006/relationships" xmlns:m="http://schemas.openxmlformats.org/officeDocument/2006/math" xmlns:v="urn:schemas-microsoft-com:vml" xmlns:wp14="http://schemas.microsoft.com/office/word/2010/wordprocessingDrawing" xmlns:wp="http://schemas.openxmlformats.org/drawingml/2006/wordprocessingDrawing" xmlns:w10="urn:schemas-microsoft-com:office:word" xmlns:w="http://schemas.openxmlformats.org/wordprocessingml/2006/main" xmlns:w14="http://schemas.microsoft.com/office/word/2010/wordml" xmlns:w15="http://schemas.microsoft.com/office/word/2012/wordml" xmlns:w16cex="http://schemas.microsoft.com/office/word/2018/wordml/cex" xmlns:w16cid="http://schemas.microsoft.com/office/word/2016/wordml/cid" xmlns:w16="http://schemas.microsoft.com/office/word/2018/wordml" xmlns:w16du="http://schemas.microsoft.com/office/word/2023/wordml/word16du" xmlns:w16sdtdh="http://schemas.microsoft.com/office/word/2020/wordml/sdtdatahash" xmlns:w16sdtfl="http://schemas.microsoft.com/office/word/2024/wordml/sdtformatlock" xmlns:w16se="http://schemas.microsoft.com/office/word/2015/wordml/symex" xmlns:wpg="http://schemas.microsoft.com/office/word/2010/wordprocessingGroup" xmlns:wpi="http://schemas.microsoft.com/office/word/2010/wordprocessingInk" xmlns:wne="http://schemas.microsoft.com/office/word/2006/wordml" xmlns:wps="http://schemas.microsoft.com/office/word/2010/wordprocessingShape" mc:Ignorable="w14 w15 w16se w16cid w16 w16cex w16sdtdh w16sdtfl w16du wp14">
   <w:footnote w:type="separator" w:id="-1">
     <w:p>
       <w:r>
@@ -22862,7 +23136,7 @@
 </file>
 
 <file path=word/numbering.xml><?xml version="1.0" encoding="utf-8"?>
-<w:numbering xmlns:wpc="http://schemas.microsoft.com/office/word/2010/wordprocessingCanvas" xmlns:cx="http://schemas.microsoft.com/office/drawing/2014/chartex" xmlns:cx1="http://schemas.microsoft.com/office/drawing/2015/9/8/chartex" xmlns:cx2="http://schemas.microsoft.com/office/drawing/2015/10/21/chartex" xmlns:cx3="http://schemas.microsoft.com/office/drawing/2016/5/9/chartex" xmlns:cx4="http://schemas.microsoft.com/office/drawing/2016/5/10/chartex" xmlns:cx5="http://schemas.microsoft.com/office/drawing/2016/5/11/chartex" xmlns:cx6="http://schemas.microsoft.com/office/drawing/2016/5/12/chartex" xmlns:cx7="http://schemas.microsoft.com/office/drawing/2016/5/13/chartex" xmlns:cx8="http://schemas.microsoft.com/office/drawing/2016/5/14/chartex" xmlns:mc="http://schemas.openxmlformats.org/markup-compatibility/2006" xmlns:aink="http://schemas.microsoft.com/office/drawing/2016/ink" xmlns:am3d="http://schemas.microsoft.com/office/drawing/2017/model3d" xmlns:o="urn:schemas-microsoft-com:office:office" xmlns:oel="http://schemas.microsoft.com/office/2019/extlst" xmlns:r="http://schemas.openxmlformats.org/officeDocument/2006/relationships" xmlns:m="http://schemas.openxmlformats.org/officeDocument/2006/math" xmlns:v="urn:schemas-microsoft-com:vml" xmlns:wp14="http://schemas.microsoft.com/office/word/2010/wordprocessingDrawing" xmlns:wp="http://schemas.openxmlformats.org/drawingml/2006/wordprocessingDrawing" xmlns:w10="urn:schemas-microsoft-com:office:word" xmlns:w="http://schemas.openxmlformats.org/wordprocessingml/2006/main" xmlns:w14="http://schemas.microsoft.com/office/word/2010/wordml" xmlns:w15="http://schemas.microsoft.com/office/word/2012/wordml" xmlns:w16cex="http://schemas.microsoft.com/office/word/2018/wordml/cex" xmlns:w16cid="http://schemas.microsoft.com/office/word/2016/wordml/cid" xmlns:w16="http://schemas.microsoft.com/office/word/2018/wordml" xmlns:w16sdtdh="http://schemas.microsoft.com/office/word/2020/wordml/sdtdatahash" xmlns:w16se="http://schemas.microsoft.com/office/word/2015/wordml/symex" xmlns:wpg="http://schemas.microsoft.com/office/word/2010/wordprocessingGroup" xmlns:wpi="http://schemas.microsoft.com/office/word/2010/wordprocessingInk" xmlns:wne="http://schemas.microsoft.com/office/word/2006/wordml" xmlns:wps="http://schemas.microsoft.com/office/word/2010/wordprocessingShape" mc:Ignorable="w14 w15 w16se w16cid w16 w16cex w16sdtdh wp14">
+<w:numbering xmlns:wpc="http://schemas.microsoft.com/office/word/2010/wordprocessingCanvas" xmlns:cx="http://schemas.microsoft.com/office/drawing/2014/chartex" xmlns:cx1="http://schemas.microsoft.com/office/drawing/2015/9/8/chartex" xmlns:cx2="http://schemas.microsoft.com/office/drawing/2015/10/21/chartex" xmlns:cx3="http://schemas.microsoft.com/office/drawing/2016/5/9/chartex" xmlns:cx4="http://schemas.microsoft.com/office/drawing/2016/5/10/chartex" xmlns:cx5="http://schemas.microsoft.com/office/drawing/2016/5/11/chartex" xmlns:cx6="http://schemas.microsoft.com/office/drawing/2016/5/12/chartex" xmlns:cx7="http://schemas.microsoft.com/office/drawing/2016/5/13/chartex" xmlns:cx8="http://schemas.microsoft.com/office/drawing/2016/5/14/chartex" xmlns:mc="http://schemas.openxmlformats.org/markup-compatibility/2006" xmlns:aink="http://schemas.microsoft.com/office/drawing/2016/ink" xmlns:am3d="http://schemas.microsoft.com/office/drawing/2017/model3d" xmlns:o="urn:schemas-microsoft-com:office:office" xmlns:oel="http://schemas.microsoft.com/office/2019/extlst" xmlns:r="http://schemas.openxmlformats.org/officeDocument/2006/relationships" xmlns:m="http://schemas.openxmlformats.org/officeDocument/2006/math" xmlns:v="urn:schemas-microsoft-com:vml" xmlns:wp14="http://schemas.microsoft.com/office/word/2010/wordprocessingDrawing" xmlns:wp="http://schemas.openxmlformats.org/drawingml/2006/wordprocessingDrawing" xmlns:w10="urn:schemas-microsoft-com:office:word" xmlns:w="http://schemas.openxmlformats.org/wordprocessingml/2006/main" xmlns:w14="http://schemas.microsoft.com/office/word/2010/wordml" xmlns:w15="http://schemas.microsoft.com/office/word/2012/wordml" xmlns:w16cex="http://schemas.microsoft.com/office/word/2018/wordml/cex" xmlns:w16cid="http://schemas.microsoft.com/office/word/2016/wordml/cid" xmlns:w16="http://schemas.microsoft.com/office/word/2018/wordml" xmlns:w16du="http://schemas.microsoft.com/office/word/2023/wordml/word16du" xmlns:w16sdtdh="http://schemas.microsoft.com/office/word/2020/wordml/sdtdatahash" xmlns:w16sdtfl="http://schemas.microsoft.com/office/word/2024/wordml/sdtformatlock" xmlns:w16se="http://schemas.microsoft.com/office/word/2015/wordml/symex" xmlns:wpg="http://schemas.microsoft.com/office/word/2010/wordprocessingGroup" xmlns:wpi="http://schemas.microsoft.com/office/word/2010/wordprocessingInk" xmlns:wne="http://schemas.microsoft.com/office/word/2006/wordml" xmlns:wps="http://schemas.microsoft.com/office/word/2010/wordprocessingShape" mc:Ignorable="w14 w15 w16se w16cid w16 w16cex w16sdtdh w16sdtfl w16du wp14">
   <w:abstractNum w:abstractNumId="0" w15:restartNumberingAfterBreak="0">
     <w:nsid w:val="FFFFFFFB"/>
     <w:multiLevelType w:val="multilevel"/>
@@ -23630,7 +23904,7 @@
 </file>
 
 <file path=word/styles.xml><?xml version="1.0" encoding="utf-8"?>
-<w:styles xmlns:mc="http://schemas.openxmlformats.org/markup-compatibility/2006" xmlns:r="http://schemas.openxmlformats.org/officeDocument/2006/relationships" xmlns:w="http://schemas.openxmlformats.org/wordprocessingml/2006/main" xmlns:w14="http://schemas.microsoft.com/office/word/2010/wordml" xmlns:w15="http://schemas.microsoft.com/office/word/2012/wordml" xmlns:w16cex="http://schemas.microsoft.com/office/word/2018/wordml/cex" xmlns:w16cid="http://schemas.microsoft.com/office/word/2016/wordml/cid" xmlns:w16="http://schemas.microsoft.com/office/word/2018/wordml" xmlns:w16sdtdh="http://schemas.microsoft.com/office/word/2020/wordml/sdtdatahash" xmlns:w16se="http://schemas.microsoft.com/office/word/2015/wordml/symex" mc:Ignorable="w14 w15 w16se w16cid w16 w16cex w16sdtdh">
+<w:styles xmlns:mc="http://schemas.openxmlformats.org/markup-compatibility/2006" xmlns:r="http://schemas.openxmlformats.org/officeDocument/2006/relationships" xmlns:w="http://schemas.openxmlformats.org/wordprocessingml/2006/main" xmlns:w14="http://schemas.microsoft.com/office/word/2010/wordml" xmlns:w15="http://schemas.microsoft.com/office/word/2012/wordml" xmlns:w16cex="http://schemas.microsoft.com/office/word/2018/wordml/cex" xmlns:w16cid="http://schemas.microsoft.com/office/word/2016/wordml/cid" xmlns:w16="http://schemas.microsoft.com/office/word/2018/wordml" xmlns:w16du="http://schemas.microsoft.com/office/word/2023/wordml/word16du" xmlns:w16sdtdh="http://schemas.microsoft.com/office/word/2020/wordml/sdtdatahash" xmlns:w16sdtfl="http://schemas.microsoft.com/office/word/2024/wordml/sdtformatlock" xmlns:w16se="http://schemas.microsoft.com/office/word/2015/wordml/symex" mc:Ignorable="w14 w15 w16se w16cid w16 w16cex w16sdtdh w16sdtfl w16du">
   <w:docDefaults>
     <w:rPrDefault>
       <w:rPr>
@@ -25380,6 +25654,58 @@
 </file>
 
 <file path=customXml/item2.xml><?xml version="1.0" encoding="utf-8"?>
+<b:Sources xmlns:b="http://schemas.openxmlformats.org/officeDocument/2006/bibliography" xmlns="http://schemas.openxmlformats.org/officeDocument/2006/bibliography" SelectedStyle="" StyleName=""/>
+</file>
+
+<file path=customXml/item3.xml><?xml version="1.0" encoding="utf-8"?>
+<p:properties xmlns:p="http://schemas.microsoft.com/office/2006/metadata/properties" xmlns:xsi="http://www.w3.org/2001/XMLSchema-instance" xmlns:pc="http://schemas.microsoft.com/office/infopath/2007/PartnerControls">
+  <documentManagement>
+    <Has_Teacher_Only_SectionGroup xmlns="f8440490-6d1a-488a-8abf-48b89d0123a0" xsi:nil="true"/>
+    <NotebookType xmlns="f8440490-6d1a-488a-8abf-48b89d0123a0" xsi:nil="true"/>
+    <DefaultSectionNames xmlns="f8440490-6d1a-488a-8abf-48b89d0123a0" xsi:nil="true"/>
+    <Self_Registration_Enabled xmlns="f8440490-6d1a-488a-8abf-48b89d0123a0" xsi:nil="true"/>
+    <FolderType xmlns="f8440490-6d1a-488a-8abf-48b89d0123a0" xsi:nil="true"/>
+    <AppVersion xmlns="f8440490-6d1a-488a-8abf-48b89d0123a0" xsi:nil="true"/>
+    <TeamsChannelId xmlns="f8440490-6d1a-488a-8abf-48b89d0123a0" xsi:nil="true"/>
+    <IsNotebookLocked xmlns="f8440490-6d1a-488a-8abf-48b89d0123a0" xsi:nil="true"/>
+    <Students xmlns="f8440490-6d1a-488a-8abf-48b89d0123a0">
+      <UserInfo>
+        <DisplayName/>
+        <AccountId xsi:nil="true"/>
+        <AccountType/>
+      </UserInfo>
+    </Students>
+    <Templates xmlns="f8440490-6d1a-488a-8abf-48b89d0123a0" xsi:nil="true"/>
+    <CultureName xmlns="f8440490-6d1a-488a-8abf-48b89d0123a0" xsi:nil="true"/>
+    <Invited_Students xmlns="f8440490-6d1a-488a-8abf-48b89d0123a0" xsi:nil="true"/>
+    <Owner xmlns="f8440490-6d1a-488a-8abf-48b89d0123a0">
+      <UserInfo>
+        <DisplayName/>
+        <AccountId xsi:nil="true"/>
+        <AccountType/>
+      </UserInfo>
+    </Owner>
+    <Teachers xmlns="f8440490-6d1a-488a-8abf-48b89d0123a0">
+      <UserInfo>
+        <DisplayName/>
+        <AccountId xsi:nil="true"/>
+        <AccountType/>
+      </UserInfo>
+    </Teachers>
+    <Student_Groups xmlns="f8440490-6d1a-488a-8abf-48b89d0123a0">
+      <UserInfo>
+        <DisplayName/>
+        <AccountId xsi:nil="true"/>
+        <AccountType/>
+      </UserInfo>
+    </Student_Groups>
+    <Invited_Teachers xmlns="f8440490-6d1a-488a-8abf-48b89d0123a0" xsi:nil="true"/>
+    <Is_Collaboration_Space_Locked xmlns="f8440490-6d1a-488a-8abf-48b89d0123a0" xsi:nil="true"/>
+  </documentManagement>
+</p:properties>
+</file>
+
+<file path=customXml/item4.xml><?xml version="1.0" encoding="utf-8"?>
 <ct:contentTypeSchema xmlns:ct="http://schemas.microsoft.com/office/2006/metadata/contentType" xmlns:ma="http://schemas.microsoft.com/office/2006/metadata/properties/metaAttributes" ct:_="" ma:_="" ma:contentTypeName="Documento" ma:contentTypeID="0x010100F13453D0801D5E45B1745A09551F1C32" ma:contentTypeVersion="28" ma:contentTypeDescription="Crie um novo documento." ma:contentTypeScope="" ma:versionID="fa9ef3803bb4ef638f344296fd7d9170">
   <xsd:schema xmlns:xsd="http://www.w3.org/2001/XMLSchema" xmlns:xs="http://www.w3.org/2001/XMLSchema" xmlns:p="http://schemas.microsoft.com/office/2006/metadata/properties" xmlns:ns3="f8440490-6d1a-488a-8abf-48b89d0123a0" xmlns:ns4="22206413-f776-4b11-bcb2-0b935dc83731" targetNamespace="http://schemas.microsoft.com/office/2006/metadata/properties" ma:root="true" ma:fieldsID="5a7e583b53460e8ff4480ccd12c418cb" ns3:_="" ns4:_="">
     <xsd:import namespace="f8440490-6d1a-488a-8abf-48b89d0123a0"/>
@@ -25754,58 +26080,6 @@
 </ct:contentTypeSchema>
 </file>
 
-<file path=customXml/item3.xml><?xml version="1.0" encoding="utf-8"?>
-<p:properties xmlns:p="http://schemas.microsoft.com/office/2006/metadata/properties" xmlns:xsi="http://www.w3.org/2001/XMLSchema-instance" xmlns:pc="http://schemas.microsoft.com/office/infopath/2007/PartnerControls">
-  <documentManagement>
-    <Has_Teacher_Only_SectionGroup xmlns="f8440490-6d1a-488a-8abf-48b89d0123a0" xsi:nil="true"/>
-    <NotebookType xmlns="f8440490-6d1a-488a-8abf-48b89d0123a0" xsi:nil="true"/>
-    <DefaultSectionNames xmlns="f8440490-6d1a-488a-8abf-48b89d0123a0" xsi:nil="true"/>
-    <Self_Registration_Enabled xmlns="f8440490-6d1a-488a-8abf-48b89d0123a0" xsi:nil="true"/>
-    <FolderType xmlns="f8440490-6d1a-488a-8abf-48b89d0123a0" xsi:nil="true"/>
-    <AppVersion xmlns="f8440490-6d1a-488a-8abf-48b89d0123a0" xsi:nil="true"/>
-    <TeamsChannelId xmlns="f8440490-6d1a-488a-8abf-48b89d0123a0" xsi:nil="true"/>
-    <IsNotebookLocked xmlns="f8440490-6d1a-488a-8abf-48b89d0123a0" xsi:nil="true"/>
-    <Students xmlns="f8440490-6d1a-488a-8abf-48b89d0123a0">
-      <UserInfo>
-        <DisplayName/>
-        <AccountId xsi:nil="true"/>
-        <AccountType/>
-      </UserInfo>
-    </Students>
-    <Templates xmlns="f8440490-6d1a-488a-8abf-48b89d0123a0" xsi:nil="true"/>
-    <CultureName xmlns="f8440490-6d1a-488a-8abf-48b89d0123a0" xsi:nil="true"/>
-    <Invited_Students xmlns="f8440490-6d1a-488a-8abf-48b89d0123a0" xsi:nil="true"/>
-    <Owner xmlns="f8440490-6d1a-488a-8abf-48b89d0123a0">
-      <UserInfo>
-        <DisplayName/>
-        <AccountId xsi:nil="true"/>
-        <AccountType/>
-      </UserInfo>
-    </Owner>
-    <Teachers xmlns="f8440490-6d1a-488a-8abf-48b89d0123a0">
-      <UserInfo>
-        <DisplayName/>
-        <AccountId xsi:nil="true"/>
-        <AccountType/>
-      </UserInfo>
-    </Teachers>
-    <Student_Groups xmlns="f8440490-6d1a-488a-8abf-48b89d0123a0">
-      <UserInfo>
-        <DisplayName/>
-        <AccountId xsi:nil="true"/>
-        <AccountType/>
-      </UserInfo>
-    </Student_Groups>
-    <Invited_Teachers xmlns="f8440490-6d1a-488a-8abf-48b89d0123a0" xsi:nil="true"/>
-    <Is_Collaboration_Space_Locked xmlns="f8440490-6d1a-488a-8abf-48b89d0123a0" xsi:nil="true"/>
-  </documentManagement>
-</p:properties>
-</file>
-
-<file path=customXml/item4.xml><?xml version="1.0" encoding="utf-8"?>
-<b:Sources xmlns:b="http://schemas.openxmlformats.org/officeDocument/2006/bibliography" xmlns="http://schemas.openxmlformats.org/officeDocument/2006/bibliography" SelectedStyle="" StyleName=""/>
-</file>
-
 <file path=customXml/itemProps1.xml><?xml version="1.0" encoding="utf-8"?>
 <ds:datastoreItem xmlns:ds="http://schemas.openxmlformats.org/officeDocument/2006/customXml" ds:itemID="{2B827772-E1CC-4349-9FCB-FE8674A2EA98}">
   <ds:schemaRefs>
@@ -25815,6 +26089,24 @@
 </file>
 
 <file path=customXml/itemProps2.xml><?xml version="1.0" encoding="utf-8"?>
+<ds:datastoreItem xmlns:ds="http://schemas.openxmlformats.org/officeDocument/2006/customXml" ds:itemID="{C4ABEB26-2A1A-47A3-9790-FB037264D9B4}">
+  <ds:schemaRefs>
+    <ds:schemaRef ds:uri="http://schemas.openxmlformats.org/officeDocument/2006/bibliography"/>
+  </ds:schemaRefs>
+</ds:datastoreItem>
+</file>
+
+<file path=customXml/itemProps3.xml><?xml version="1.0" encoding="utf-8"?>
+<ds:datastoreItem xmlns:ds="http://schemas.openxmlformats.org/officeDocument/2006/customXml" ds:itemID="{8DA352C3-1804-4B1A-A44A-0C8F651EBE51}">
+  <ds:schemaRefs>
+    <ds:schemaRef ds:uri="http://schemas.microsoft.com/office/2006/metadata/properties"/>
+    <ds:schemaRef ds:uri="http://schemas.microsoft.com/office/infopath/2007/PartnerControls"/>
+    <ds:schemaRef ds:uri="f8440490-6d1a-488a-8abf-48b89d0123a0"/>
+  </ds:schemaRefs>
+</ds:datastoreItem>
+</file>
+
+<file path=customXml/itemProps4.xml><?xml version="1.0" encoding="utf-8"?>
 <ds:datastoreItem xmlns:ds="http://schemas.openxmlformats.org/officeDocument/2006/customXml" ds:itemID="{5AB50341-27D8-4A77-A704-8A35390CE9B7}">
   <ds:schemaRefs>
     <ds:schemaRef ds:uri="http://schemas.microsoft.com/office/2006/metadata/contentType"/>
@@ -25831,22 +26123,4 @@
     <ds:schemaRef ds:uri="http://schemas.microsoft.com/internal/obd"/>
   </ds:schemaRefs>
 </ds:datastoreItem>
-</file>
-
-<file path=customXml/itemProps3.xml><?xml version="1.0" encoding="utf-8"?>
-<ds:datastoreItem xmlns:ds="http://schemas.openxmlformats.org/officeDocument/2006/customXml" ds:itemID="{8DA352C3-1804-4B1A-A44A-0C8F651EBE51}">
-  <ds:schemaRefs>
-    <ds:schemaRef ds:uri="http://schemas.microsoft.com/office/2006/metadata/properties"/>
-    <ds:schemaRef ds:uri="http://schemas.microsoft.com/office/infopath/2007/PartnerControls"/>
-    <ds:schemaRef ds:uri="f8440490-6d1a-488a-8abf-48b89d0123a0"/>
-  </ds:schemaRefs>
-</ds:datastoreItem>
-</file>
-
-<file path=customXml/itemProps4.xml><?xml version="1.0" encoding="utf-8"?>
-<ds:datastoreItem xmlns:ds="http://schemas.openxmlformats.org/officeDocument/2006/customXml" ds:itemID="{C4ABEB26-2A1A-47A3-9790-FB037264D9B4}">
-  <ds:schemaRefs>
-    <ds:schemaRef ds:uri="http://schemas.openxmlformats.org/officeDocument/2006/bibliography"/>
-  </ds:schemaRefs>
-</ds:datastoreItem>
 </file>
</xml_diff>